<commit_message>
Add the team's names to the deck, report, kit and README
Co-Authored-By: Claude Opus 5 <noreply@anthropic.com>
</commit_message>
<xml_diff>
--- a/docs/RAD-SMART_Research_Report.docx
+++ b/docs/RAD-SMART_Research_Report.docx
@@ -38,7 +38,7 @@
           <w:b w:val="0"/>
           <w:i w:val="0"/>
         </w:rPr>
-        <w:t>Problem owner and doctor partner: Dr Akshay Dinesan, Manipal · Technology team: [names to be added] · Version 1.1, 21 September 2026 (updated with the department's answers)</w:t>
+        <w:t>Team leader, problem owner and doctor partner: Dr Akshay Dinesan, Manipal · Technical lead: Abhinand T M · Team: P S Raghotham Rao, Dr Shirley Lewis Salins, Dr Umesh Velu · Version 1.1, 21 September 2026 (updated with the department's answers)</w:t>
       </w:r>
     </w:p>
     <w:p>
@@ -18611,7 +18611,7 @@
       <w:tr>
         <w:tc>
           <w:tcPr>
-            <w:tcW w:type="dxa" w:w="2855"/>
+            <w:tcW w:type="dxa" w:w="3416"/>
             <w:shd w:val="clear" w:color="auto" w:fill="E8EFF9"/>
           </w:tcPr>
           <w:p>
@@ -18630,7 +18630,7 @@
         </w:tc>
         <w:tc>
           <w:tcPr>
-            <w:tcW w:type="dxa" w:w="2993"/>
+            <w:tcW w:type="dxa" w:w="2746"/>
             <w:shd w:val="clear" w:color="auto" w:fill="E8EFF9"/>
           </w:tcPr>
           <w:p>
@@ -18649,7 +18649,7 @@
         </w:tc>
         <w:tc>
           <w:tcPr>
-            <w:tcW w:type="dxa" w:w="3789"/>
+            <w:tcW w:type="dxa" w:w="3476"/>
             <w:shd w:val="clear" w:color="auto" w:fill="E8EFF9"/>
           </w:tcPr>
           <w:p>
@@ -18670,25 +18670,25 @@
       <w:tr>
         <w:tc>
           <w:tcPr>
-            <w:tcW w:type="dxa" w:w="2855"/>
-          </w:tcPr>
-          <w:p>
-            <w:pPr>
-              <w:spacing w:after="0"/>
-            </w:pPr>
-            <w:r>
-              <w:rPr>
-                <w:b w:val="0"/>
-                <w:i w:val="0"/>
-                <w:sz w:val="18"/>
-              </w:rPr>
-              <w:t>Doctor partner and clinical owner</w:t>
-            </w:r>
-          </w:p>
-        </w:tc>
-        <w:tc>
-          <w:tcPr>
-            <w:tcW w:type="dxa" w:w="2993"/>
+            <w:tcW w:type="dxa" w:w="3416"/>
+          </w:tcPr>
+          <w:p>
+            <w:pPr>
+              <w:spacing w:after="0"/>
+            </w:pPr>
+            <w:r>
+              <w:rPr>
+                <w:b w:val="0"/>
+                <w:i w:val="0"/>
+                <w:sz w:val="18"/>
+              </w:rPr>
+              <w:t>Team leader, doctor partner and clinical owner</w:t>
+            </w:r>
+          </w:p>
+        </w:tc>
+        <w:tc>
+          <w:tcPr>
+            <w:tcW w:type="dxa" w:w="2746"/>
           </w:tcPr>
           <w:p>
             <w:pPr>
@@ -18706,7 +18706,7 @@
         </w:tc>
         <w:tc>
           <w:tcPr>
-            <w:tcW w:type="dxa" w:w="3789"/>
+            <w:tcW w:type="dxa" w:w="3476"/>
           </w:tcPr>
           <w:p>
             <w:pPr>
@@ -18726,7 +18726,7 @@
       <w:tr>
         <w:tc>
           <w:tcPr>
-            <w:tcW w:type="dxa" w:w="2855"/>
+            <w:tcW w:type="dxa" w:w="3416"/>
           </w:tcPr>
           <w:p>
             <w:pPr>
@@ -18744,25 +18744,25 @@
         </w:tc>
         <w:tc>
           <w:tcPr>
-            <w:tcW w:type="dxa" w:w="2993"/>
-          </w:tcPr>
-          <w:p>
-            <w:pPr>
-              <w:spacing w:after="0"/>
-            </w:pPr>
-            <w:r>
-              <w:rPr>
-                <w:b w:val="0"/>
-                <w:i w:val="0"/>
-                <w:sz w:val="18"/>
-              </w:rPr>
-              <w:t>[name]</w:t>
-            </w:r>
-          </w:p>
-        </w:tc>
-        <w:tc>
-          <w:tcPr>
-            <w:tcW w:type="dxa" w:w="3789"/>
+            <w:tcW w:type="dxa" w:w="2746"/>
+          </w:tcPr>
+          <w:p>
+            <w:pPr>
+              <w:spacing w:after="0"/>
+            </w:pPr>
+            <w:r>
+              <w:rPr>
+                <w:b w:val="0"/>
+                <w:i w:val="0"/>
+                <w:sz w:val="18"/>
+              </w:rPr>
+              <w:t>Abhinand T M</w:t>
+            </w:r>
+          </w:p>
+        </w:tc>
+        <w:tc>
+          <w:tcPr>
+            <w:tcW w:type="dxa" w:w="3476"/>
           </w:tcPr>
           <w:p>
             <w:pPr>
@@ -18782,43 +18782,43 @@
       <w:tr>
         <w:tc>
           <w:tcPr>
-            <w:tcW w:type="dxa" w:w="2855"/>
-          </w:tcPr>
-          <w:p>
-            <w:pPr>
-              <w:spacing w:after="0"/>
-            </w:pPr>
-            <w:r>
-              <w:rPr>
-                <w:b w:val="0"/>
-                <w:i w:val="0"/>
-                <w:sz w:val="18"/>
-              </w:rPr>
-              <w:t>Optimisation and ML engineer</w:t>
-            </w:r>
-          </w:p>
-        </w:tc>
-        <w:tc>
-          <w:tcPr>
-            <w:tcW w:type="dxa" w:w="2993"/>
-          </w:tcPr>
-          <w:p>
-            <w:pPr>
-              <w:spacing w:after="0"/>
-            </w:pPr>
-            <w:r>
-              <w:rPr>
-                <w:b w:val="0"/>
-                <w:i w:val="0"/>
-                <w:sz w:val="18"/>
-              </w:rPr>
-              <w:t>[name]</w:t>
-            </w:r>
-          </w:p>
-        </w:tc>
-        <w:tc>
-          <w:tcPr>
-            <w:tcW w:type="dxa" w:w="3789"/>
+            <w:tcW w:type="dxa" w:w="3416"/>
+          </w:tcPr>
+          <w:p>
+            <w:pPr>
+              <w:spacing w:after="0"/>
+            </w:pPr>
+            <w:r>
+              <w:rPr>
+                <w:b w:val="0"/>
+                <w:i w:val="0"/>
+                <w:sz w:val="18"/>
+              </w:rPr>
+              <w:t>Team member</w:t>
+            </w:r>
+          </w:p>
+        </w:tc>
+        <w:tc>
+          <w:tcPr>
+            <w:tcW w:type="dxa" w:w="2746"/>
+          </w:tcPr>
+          <w:p>
+            <w:pPr>
+              <w:spacing w:after="0"/>
+            </w:pPr>
+            <w:r>
+              <w:rPr>
+                <w:b w:val="0"/>
+                <w:i w:val="0"/>
+                <w:sz w:val="18"/>
+              </w:rPr>
+              <w:t>P S Raghotham Rao</w:t>
+            </w:r>
+          </w:p>
+        </w:tc>
+        <w:tc>
+          <w:tcPr>
+            <w:tcW w:type="dxa" w:w="3476"/>
           </w:tcPr>
           <w:p>
             <w:pPr>
@@ -18838,55 +18838,55 @@
       <w:tr>
         <w:tc>
           <w:tcPr>
-            <w:tcW w:type="dxa" w:w="2855"/>
-          </w:tcPr>
-          <w:p>
-            <w:pPr>
-              <w:spacing w:after="0"/>
-            </w:pPr>
-            <w:r>
-              <w:rPr>
-                <w:b w:val="0"/>
-                <w:i w:val="0"/>
-                <w:sz w:val="18"/>
-              </w:rPr>
-              <w:t>Full-stack and messaging engineer</w:t>
-            </w:r>
-          </w:p>
-        </w:tc>
-        <w:tc>
-          <w:tcPr>
-            <w:tcW w:type="dxa" w:w="2993"/>
-          </w:tcPr>
-          <w:p>
-            <w:pPr>
-              <w:spacing w:after="0"/>
-            </w:pPr>
-            <w:r>
-              <w:rPr>
-                <w:b w:val="0"/>
-                <w:i w:val="0"/>
-                <w:sz w:val="18"/>
-              </w:rPr>
-              <w:t>[name]</w:t>
-            </w:r>
-          </w:p>
-        </w:tc>
-        <w:tc>
-          <w:tcPr>
-            <w:tcW w:type="dxa" w:w="3789"/>
-          </w:tcPr>
-          <w:p>
-            <w:pPr>
-              <w:spacing w:after="0"/>
-            </w:pPr>
-            <w:r>
-              <w:rPr>
-                <w:b w:val="0"/>
-                <w:i w:val="0"/>
-                <w:sz w:val="18"/>
-              </w:rPr>
-              <w:t>full sprint</w:t>
+            <w:tcW w:type="dxa" w:w="3416"/>
+          </w:tcPr>
+          <w:p>
+            <w:pPr>
+              <w:spacing w:after="0"/>
+            </w:pPr>
+            <w:r>
+              <w:rPr>
+                <w:b w:val="0"/>
+                <w:i w:val="0"/>
+                <w:sz w:val="18"/>
+              </w:rPr>
+              <w:t>Team member</w:t>
+            </w:r>
+          </w:p>
+        </w:tc>
+        <w:tc>
+          <w:tcPr>
+            <w:tcW w:type="dxa" w:w="2746"/>
+          </w:tcPr>
+          <w:p>
+            <w:pPr>
+              <w:spacing w:after="0"/>
+            </w:pPr>
+            <w:r>
+              <w:rPr>
+                <w:b w:val="0"/>
+                <w:i w:val="0"/>
+                <w:sz w:val="18"/>
+              </w:rPr>
+              <w:t>Dr Shirley Lewis Salins</w:t>
+            </w:r>
+          </w:p>
+        </w:tc>
+        <w:tc>
+          <w:tcPr>
+            <w:tcW w:type="dxa" w:w="3476"/>
+          </w:tcPr>
+          <w:p>
+            <w:pPr>
+              <w:spacing w:after="0"/>
+            </w:pPr>
+            <w:r>
+              <w:rPr>
+                <w:b w:val="0"/>
+                <w:i w:val="0"/>
+                <w:sz w:val="18"/>
+              </w:rPr>
+              <w:t>sprint and pilot</w:t>
             </w:r>
           </w:p>
         </w:tc>
@@ -18894,55 +18894,55 @@
       <w:tr>
         <w:tc>
           <w:tcPr>
-            <w:tcW w:type="dxa" w:w="2855"/>
-          </w:tcPr>
-          <w:p>
-            <w:pPr>
-              <w:spacing w:after="0"/>
-            </w:pPr>
-            <w:r>
-              <w:rPr>
-                <w:b w:val="0"/>
-                <w:i w:val="0"/>
-                <w:sz w:val="18"/>
-              </w:rPr>
-              <w:t>RTT champion (pilot)</w:t>
-            </w:r>
-          </w:p>
-        </w:tc>
-        <w:tc>
-          <w:tcPr>
-            <w:tcW w:type="dxa" w:w="2993"/>
-          </w:tcPr>
-          <w:p>
-            <w:pPr>
-              <w:spacing w:after="0"/>
-            </w:pPr>
-            <w:r>
-              <w:rPr>
-                <w:b w:val="0"/>
-                <w:i w:val="0"/>
-                <w:sz w:val="18"/>
-              </w:rPr>
-              <w:t>[to be nominated by the department]</w:t>
-            </w:r>
-          </w:p>
-        </w:tc>
-        <w:tc>
-          <w:tcPr>
-            <w:tcW w:type="dxa" w:w="3789"/>
-          </w:tcPr>
-          <w:p>
-            <w:pPr>
-              <w:spacing w:after="0"/>
-            </w:pPr>
-            <w:r>
-              <w:rPr>
-                <w:b w:val="0"/>
-                <w:i w:val="0"/>
-                <w:sz w:val="18"/>
-              </w:rPr>
-              <w:t>about 1 h per week</w:t>
+            <w:tcW w:type="dxa" w:w="3416"/>
+          </w:tcPr>
+          <w:p>
+            <w:pPr>
+              <w:spacing w:after="0"/>
+            </w:pPr>
+            <w:r>
+              <w:rPr>
+                <w:b w:val="0"/>
+                <w:i w:val="0"/>
+                <w:sz w:val="18"/>
+              </w:rPr>
+              <w:t>Team member</w:t>
+            </w:r>
+          </w:p>
+        </w:tc>
+        <w:tc>
+          <w:tcPr>
+            <w:tcW w:type="dxa" w:w="2746"/>
+          </w:tcPr>
+          <w:p>
+            <w:pPr>
+              <w:spacing w:after="0"/>
+            </w:pPr>
+            <w:r>
+              <w:rPr>
+                <w:b w:val="0"/>
+                <w:i w:val="0"/>
+                <w:sz w:val="18"/>
+              </w:rPr>
+              <w:t>Dr Umesh Velu</w:t>
+            </w:r>
+          </w:p>
+        </w:tc>
+        <w:tc>
+          <w:tcPr>
+            <w:tcW w:type="dxa" w:w="3476"/>
+          </w:tcPr>
+          <w:p>
+            <w:pPr>
+              <w:spacing w:after="0"/>
+            </w:pPr>
+            <w:r>
+              <w:rPr>
+                <w:b w:val="0"/>
+                <w:i w:val="0"/>
+                <w:sz w:val="18"/>
+              </w:rPr>
+              <w:t>sprint and pilot</w:t>
             </w:r>
           </w:p>
         </w:tc>
@@ -18950,55 +18950,55 @@
       <w:tr>
         <w:tc>
           <w:tcPr>
-            <w:tcW w:type="dxa" w:w="2855"/>
-          </w:tcPr>
-          <w:p>
-            <w:pPr>
-              <w:spacing w:after="0"/>
-            </w:pPr>
-            <w:r>
-              <w:rPr>
-                <w:b w:val="0"/>
-                <w:i w:val="0"/>
-                <w:sz w:val="18"/>
-              </w:rPr>
-              <w:t>Plan approver</w:t>
-            </w:r>
-          </w:p>
-        </w:tc>
-        <w:tc>
-          <w:tcPr>
-            <w:tcW w:type="dxa" w:w="2993"/>
-          </w:tcPr>
-          <w:p>
-            <w:pPr>
-              <w:spacing w:after="0"/>
-            </w:pPr>
-            <w:r>
-              <w:rPr>
-                <w:b w:val="0"/>
-                <w:i w:val="0"/>
-                <w:sz w:val="18"/>
-              </w:rPr>
-              <w:t>designated senior RTT or oncologist</w:t>
-            </w:r>
-          </w:p>
-        </w:tc>
-        <w:tc>
-          <w:tcPr>
-            <w:tcW w:type="dxa" w:w="3789"/>
-          </w:tcPr>
-          <w:p>
-            <w:pPr>
-              <w:spacing w:after="0"/>
-            </w:pPr>
-            <w:r>
-              <w:rPr>
-                <w:b w:val="0"/>
-                <w:i w:val="0"/>
-                <w:sz w:val="18"/>
-              </w:rPr>
-              <w:t>daily during the live phase</w:t>
+            <w:tcW w:type="dxa" w:w="3416"/>
+          </w:tcPr>
+          <w:p>
+            <w:pPr>
+              <w:spacing w:after="0"/>
+            </w:pPr>
+            <w:r>
+              <w:rPr>
+                <w:b w:val="0"/>
+                <w:i w:val="0"/>
+                <w:sz w:val="18"/>
+              </w:rPr>
+              <w:t>RTT champion (pilot)</w:t>
+            </w:r>
+          </w:p>
+        </w:tc>
+        <w:tc>
+          <w:tcPr>
+            <w:tcW w:type="dxa" w:w="2746"/>
+          </w:tcPr>
+          <w:p>
+            <w:pPr>
+              <w:spacing w:after="0"/>
+            </w:pPr>
+            <w:r>
+              <w:rPr>
+                <w:b w:val="0"/>
+                <w:i w:val="0"/>
+                <w:sz w:val="18"/>
+              </w:rPr>
+              <w:t>[to be nominated by the department]</w:t>
+            </w:r>
+          </w:p>
+        </w:tc>
+        <w:tc>
+          <w:tcPr>
+            <w:tcW w:type="dxa" w:w="3476"/>
+          </w:tcPr>
+          <w:p>
+            <w:pPr>
+              <w:spacing w:after="0"/>
+            </w:pPr>
+            <w:r>
+              <w:rPr>
+                <w:b w:val="0"/>
+                <w:i w:val="0"/>
+                <w:sz w:val="18"/>
+              </w:rPr>
+              <w:t>about 1 h per week</w:t>
             </w:r>
           </w:p>
         </w:tc>
@@ -19006,55 +19006,55 @@
       <w:tr>
         <w:tc>
           <w:tcPr>
-            <w:tcW w:type="dxa" w:w="2855"/>
-          </w:tcPr>
-          <w:p>
-            <w:pPr>
-              <w:spacing w:after="0"/>
-            </w:pPr>
-            <w:r>
-              <w:rPr>
-                <w:b w:val="0"/>
-                <w:i w:val="0"/>
-                <w:sz w:val="18"/>
-              </w:rPr>
-              <w:t>Medical physicist</w:t>
-            </w:r>
-          </w:p>
-        </w:tc>
-        <w:tc>
-          <w:tcPr>
-            <w:tcW w:type="dxa" w:w="2993"/>
-          </w:tcPr>
-          <w:p>
-            <w:pPr>
-              <w:spacing w:after="0"/>
-            </w:pPr>
-            <w:r>
-              <w:rPr>
-                <w:b w:val="0"/>
-                <w:i w:val="0"/>
-                <w:sz w:val="18"/>
-              </w:rPr>
-              <w:t>[to be nominated]</w:t>
-            </w:r>
-          </w:p>
-        </w:tc>
-        <w:tc>
-          <w:tcPr>
-            <w:tcW w:type="dxa" w:w="3789"/>
-          </w:tcPr>
-          <w:p>
-            <w:pPr>
-              <w:spacing w:after="0"/>
-            </w:pPr>
-            <w:r>
-              <w:rPr>
-                <w:b w:val="0"/>
-                <w:i w:val="0"/>
-                <w:sz w:val="18"/>
-              </w:rPr>
-              <w:t>machine capability matrix; rule review</w:t>
+            <w:tcW w:type="dxa" w:w="3416"/>
+          </w:tcPr>
+          <w:p>
+            <w:pPr>
+              <w:spacing w:after="0"/>
+            </w:pPr>
+            <w:r>
+              <w:rPr>
+                <w:b w:val="0"/>
+                <w:i w:val="0"/>
+                <w:sz w:val="18"/>
+              </w:rPr>
+              <w:t>Plan approver</w:t>
+            </w:r>
+          </w:p>
+        </w:tc>
+        <w:tc>
+          <w:tcPr>
+            <w:tcW w:type="dxa" w:w="2746"/>
+          </w:tcPr>
+          <w:p>
+            <w:pPr>
+              <w:spacing w:after="0"/>
+            </w:pPr>
+            <w:r>
+              <w:rPr>
+                <w:b w:val="0"/>
+                <w:i w:val="0"/>
+                <w:sz w:val="18"/>
+              </w:rPr>
+              <w:t>designated senior RTT or oncologist</w:t>
+            </w:r>
+          </w:p>
+        </w:tc>
+        <w:tc>
+          <w:tcPr>
+            <w:tcW w:type="dxa" w:w="3476"/>
+          </w:tcPr>
+          <w:p>
+            <w:pPr>
+              <w:spacing w:after="0"/>
+            </w:pPr>
+            <w:r>
+              <w:rPr>
+                <w:b w:val="0"/>
+                <w:i w:val="0"/>
+                <w:sz w:val="18"/>
+              </w:rPr>
+              <w:t>daily during the live phase</w:t>
             </w:r>
           </w:p>
         </w:tc>
@@ -19062,7 +19062,63 @@
       <w:tr>
         <w:tc>
           <w:tcPr>
-            <w:tcW w:type="dxa" w:w="2855"/>
+            <w:tcW w:type="dxa" w:w="3416"/>
+          </w:tcPr>
+          <w:p>
+            <w:pPr>
+              <w:spacing w:after="0"/>
+            </w:pPr>
+            <w:r>
+              <w:rPr>
+                <w:b w:val="0"/>
+                <w:i w:val="0"/>
+                <w:sz w:val="18"/>
+              </w:rPr>
+              <w:t>Medical physicist</w:t>
+            </w:r>
+          </w:p>
+        </w:tc>
+        <w:tc>
+          <w:tcPr>
+            <w:tcW w:type="dxa" w:w="2746"/>
+          </w:tcPr>
+          <w:p>
+            <w:pPr>
+              <w:spacing w:after="0"/>
+            </w:pPr>
+            <w:r>
+              <w:rPr>
+                <w:b w:val="0"/>
+                <w:i w:val="0"/>
+                <w:sz w:val="18"/>
+              </w:rPr>
+              <w:t>[to be nominated]</w:t>
+            </w:r>
+          </w:p>
+        </w:tc>
+        <w:tc>
+          <w:tcPr>
+            <w:tcW w:type="dxa" w:w="3476"/>
+          </w:tcPr>
+          <w:p>
+            <w:pPr>
+              <w:spacing w:after="0"/>
+            </w:pPr>
+            <w:r>
+              <w:rPr>
+                <w:b w:val="0"/>
+                <w:i w:val="0"/>
+                <w:sz w:val="18"/>
+              </w:rPr>
+              <w:t>machine capability matrix; rule review</w:t>
+            </w:r>
+          </w:p>
+        </w:tc>
+      </w:tr>
+      <w:tr>
+        <w:tc>
+          <w:tcPr>
+            <w:tcW w:type="dxa" w:w="3416"/>
           </w:tcPr>
           <w:p>
             <w:pPr>
@@ -19080,7 +19136,7 @@
         </w:tc>
         <w:tc>
           <w:tcPr>
-            <w:tcW w:type="dxa" w:w="2993"/>
+            <w:tcW w:type="dxa" w:w="2746"/>
           </w:tcPr>
           <w:p>
             <w:pPr>
@@ -19098,7 +19154,7 @@
         </w:tc>
         <w:tc>
           <w:tcPr>
-            <w:tcW w:type="dxa" w:w="3789"/>
+            <w:tcW w:type="dxa" w:w="3476"/>
           </w:tcPr>
           <w:p>
             <w:pPr>

</xml_diff>